<commit_message>
04.04.26 bis 06.05.26 (teilweise)
</commit_message>
<xml_diff>
--- a/LF9/Netzwerke_MathGrundlagen_Graphen.docx
+++ b/LF9/Netzwerke_MathGrundlagen_Graphen.docx
@@ -158,15 +158,7 @@
           <w:bCs w:val="false"/>
           <w:u w:val="none"/>
         </w:rPr>
-        <w:t xml:space="preserve">- </w:t>
-      </w:r>
-      <w:r>
-        <w:rPr>
-          <w:b w:val="false"/>
-          <w:bCs w:val="false"/>
-          <w:u w:val="none"/>
-        </w:rPr>
-        <w:t>E={(1,2), (1.3), (2,3), (3,4)}</w:t>
+        <w:t>- E={(1,2), (1.3), (2,3), (3,4)}</w:t>
       </w:r>
     </w:p>
     <w:p>
@@ -522,6 +514,1024 @@
           <w:u w:val="none"/>
         </w:rPr>
         <w:t>1-3-2 schneller als 1-2</w:t>
+      </w:r>
+    </w:p>
+    <w:p>
+      <w:pPr>
+        <w:pStyle w:val="Normal"/>
+        <w:bidi w:val="0"/>
+        <w:jc w:val="left"/>
+        <w:rPr>
+          <w:b w:val="false"/>
+          <w:bCs w:val="false"/>
+          <w:u w:val="none"/>
+        </w:rPr>
+      </w:pPr>
+      <w:r>
+        <w:rPr>
+          <w:b w:val="false"/>
+          <w:bCs w:val="false"/>
+          <w:u w:val="none"/>
+        </w:rPr>
+      </w:r>
+    </w:p>
+    <w:p>
+      <w:pPr>
+        <w:pStyle w:val="Normal"/>
+        <w:bidi w:val="0"/>
+        <w:jc w:val="left"/>
+        <w:rPr>
+          <w:b w:val="false"/>
+          <w:bCs w:val="false"/>
+          <w:u w:val="none"/>
+        </w:rPr>
+      </w:pPr>
+      <w:r>
+        <w:rPr>
+          <w:b w:val="false"/>
+          <w:bCs w:val="false"/>
+          <w:u w:val="none"/>
+        </w:rPr>
+      </w:r>
+    </w:p>
+    <w:p>
+      <w:pPr>
+        <w:pStyle w:val="Normal"/>
+        <w:bidi w:val="0"/>
+        <w:jc w:val="left"/>
+        <w:rPr>
+          <w:b/>
+          <w:bCs/>
+          <w:u w:val="single"/>
+        </w:rPr>
+      </w:pPr>
+      <w:r>
+        <w:rPr>
+          <w:b/>
+          <w:bCs/>
+          <w:u w:val="single"/>
+        </w:rPr>
+        <w:t>Vermittlungsschicht/Internetschicht</w:t>
+      </w:r>
+    </w:p>
+    <w:p>
+      <w:pPr>
+        <w:pStyle w:val="Normal"/>
+        <w:bidi w:val="0"/>
+        <w:jc w:val="left"/>
+        <w:rPr>
+          <w:b w:val="false"/>
+          <w:bCs w:val="false"/>
+          <w:u w:val="none"/>
+        </w:rPr>
+      </w:pPr>
+      <w:r>
+        <w:rPr>
+          <w:b w:val="false"/>
+          <w:bCs w:val="false"/>
+          <w:u w:val="none"/>
+        </w:rPr>
+        <w:t>- Beförderung von Datenpaketen vom Sender zum Empfänger</w:t>
+      </w:r>
+    </w:p>
+    <w:p>
+      <w:pPr>
+        <w:pStyle w:val="Normal"/>
+        <w:bidi w:val="0"/>
+        <w:jc w:val="left"/>
+        <w:rPr>
+          <w:b w:val="false"/>
+          <w:bCs w:val="false"/>
+          <w:u w:val="none"/>
+        </w:rPr>
+      </w:pPr>
+      <w:r>
+        <w:rPr>
+          <w:b w:val="false"/>
+          <w:bCs w:val="false"/>
+          <w:u w:val="none"/>
+        </w:rPr>
+        <w:t>- Verfahren:</w:t>
+      </w:r>
+    </w:p>
+    <w:p>
+      <w:pPr>
+        <w:pStyle w:val="Normal"/>
+        <w:bidi w:val="0"/>
+        <w:jc w:val="left"/>
+        <w:rPr>
+          <w:b w:val="false"/>
+          <w:bCs w:val="false"/>
+          <w:u w:val="none"/>
+        </w:rPr>
+      </w:pPr>
+      <w:r>
+        <w:rPr>
+          <w:b w:val="false"/>
+          <w:bCs w:val="false"/>
+          <w:u w:val="none"/>
+        </w:rPr>
+        <w:tab/>
+        <w:t>- nicht adaptiv</w:t>
+      </w:r>
+    </w:p>
+    <w:p>
+      <w:pPr>
+        <w:pStyle w:val="Normal"/>
+        <w:bidi w:val="0"/>
+        <w:jc w:val="left"/>
+        <w:rPr>
+          <w:b w:val="false"/>
+          <w:bCs w:val="false"/>
+          <w:u w:val="none"/>
+        </w:rPr>
+      </w:pPr>
+      <w:r>
+        <w:rPr>
+          <w:b w:val="false"/>
+          <w:bCs w:val="false"/>
+          <w:u w:val="none"/>
+        </w:rPr>
+        <w:tab/>
+        <w:tab/>
+        <w:t>- Bestimmung der Leitwege vor Inbetriebnahme des Netzes</w:t>
+      </w:r>
+    </w:p>
+    <w:p>
+      <w:pPr>
+        <w:pStyle w:val="Normal"/>
+        <w:bidi w:val="0"/>
+        <w:jc w:val="left"/>
+        <w:rPr>
+          <w:b w:val="false"/>
+          <w:bCs w:val="false"/>
+          <w:u w:val="none"/>
+        </w:rPr>
+      </w:pPr>
+      <w:r>
+        <w:rPr>
+          <w:b w:val="false"/>
+          <w:bCs w:val="false"/>
+          <w:u w:val="none"/>
+        </w:rPr>
+        <w:tab/>
+        <w:tab/>
+        <w:t>- keine Berücksichtigung des aktuellen Zustands des Netzes</w:t>
+      </w:r>
+    </w:p>
+    <w:p>
+      <w:pPr>
+        <w:pStyle w:val="Normal"/>
+        <w:bidi w:val="0"/>
+        <w:jc w:val="left"/>
+        <w:rPr>
+          <w:b w:val="false"/>
+          <w:bCs w:val="false"/>
+          <w:u w:val="none"/>
+        </w:rPr>
+      </w:pPr>
+      <w:r>
+        <w:rPr>
+          <w:b w:val="false"/>
+          <w:bCs w:val="false"/>
+          <w:u w:val="none"/>
+        </w:rPr>
+        <w:tab/>
+        <w:t>- adaptiv</w:t>
+      </w:r>
+    </w:p>
+    <w:p>
+      <w:pPr>
+        <w:pStyle w:val="Normal"/>
+        <w:bidi w:val="0"/>
+        <w:jc w:val="left"/>
+        <w:rPr>
+          <w:b w:val="false"/>
+          <w:bCs w:val="false"/>
+          <w:u w:val="none"/>
+        </w:rPr>
+      </w:pPr>
+      <w:r>
+        <w:rPr>
+          <w:b w:val="false"/>
+          <w:bCs w:val="false"/>
+          <w:u w:val="none"/>
+        </w:rPr>
+        <w:tab/>
+        <w:tab/>
+        <w:t xml:space="preserve">- Leitwege basieren auf dem aktuellen Zustand des Netzes </w:t>
+      </w:r>
+    </w:p>
+    <w:p>
+      <w:pPr>
+        <w:pStyle w:val="Normal"/>
+        <w:bidi w:val="0"/>
+        <w:jc w:val="left"/>
+        <w:rPr>
+          <w:b w:val="false"/>
+          <w:bCs w:val="false"/>
+          <w:u w:val="none"/>
+        </w:rPr>
+      </w:pPr>
+      <w:r>
+        <w:rPr>
+          <w:b w:val="false"/>
+          <w:bCs w:val="false"/>
+          <w:u w:val="none"/>
+        </w:rPr>
+        <w:tab/>
+        <w:tab/>
+        <w:t>- Änderung der Leitwege bei Bedarf</w:t>
+      </w:r>
+    </w:p>
+    <w:p>
+      <w:pPr>
+        <w:pStyle w:val="Normal"/>
+        <w:bidi w:val="0"/>
+        <w:jc w:val="left"/>
+        <w:rPr>
+          <w:b w:val="false"/>
+          <w:bCs w:val="false"/>
+          <w:u w:val="none"/>
+        </w:rPr>
+      </w:pPr>
+      <w:r>
+        <w:rPr>
+          <w:b w:val="false"/>
+          <w:bCs w:val="false"/>
+          <w:u w:val="none"/>
+        </w:rPr>
+      </w:r>
+    </w:p>
+    <w:p>
+      <w:pPr>
+        <w:pStyle w:val="Normal"/>
+        <w:bidi w:val="0"/>
+        <w:jc w:val="left"/>
+        <w:rPr>
+          <w:b w:val="false"/>
+          <w:bCs w:val="false"/>
+          <w:u w:val="none"/>
+        </w:rPr>
+      </w:pPr>
+      <w:r>
+        <w:rPr>
+          <w:b w:val="false"/>
+          <w:bCs w:val="false"/>
+          <w:u w:val="none"/>
+        </w:rPr>
+      </w:r>
+    </w:p>
+    <w:p>
+      <w:pPr>
+        <w:pStyle w:val="Normal"/>
+        <w:bidi w:val="0"/>
+        <w:jc w:val="center"/>
+        <w:rPr>
+          <w:b/>
+          <w:bCs/>
+          <w:u w:val="single"/>
+        </w:rPr>
+      </w:pPr>
+      <w:r>
+        <w:rPr>
+          <w:b/>
+          <w:bCs/>
+          <w:u w:val="single"/>
+        </w:rPr>
+        <w:t>OSPF</w:t>
+      </w:r>
+    </w:p>
+    <w:p>
+      <w:pPr>
+        <w:pStyle w:val="Normal"/>
+        <w:bidi w:val="0"/>
+        <w:jc w:val="left"/>
+        <w:rPr>
+          <w:b w:val="false"/>
+          <w:bCs w:val="false"/>
+          <w:u w:val="none"/>
+        </w:rPr>
+      </w:pPr>
+      <w:r>
+        <w:rPr>
+          <w:b w:val="false"/>
+          <w:bCs w:val="false"/>
+          <w:u w:val="none"/>
+        </w:rPr>
+        <w:t>- Open Shortest Path First</w:t>
+      </w:r>
+    </w:p>
+    <w:p>
+      <w:pPr>
+        <w:pStyle w:val="Normal"/>
+        <w:bidi w:val="0"/>
+        <w:jc w:val="left"/>
+        <w:rPr>
+          <w:b/>
+          <w:bCs/>
+          <w:u w:val="single"/>
+        </w:rPr>
+      </w:pPr>
+      <w:r>
+        <w:rPr>
+          <w:b/>
+          <w:bCs/>
+          <w:u w:val="single"/>
+        </w:rPr>
+        <w:t>- Besteht aus 3 Algorithmen</w:t>
+      </w:r>
+    </w:p>
+    <w:p>
+      <w:pPr>
+        <w:pStyle w:val="Normal"/>
+        <w:bidi w:val="0"/>
+        <w:jc w:val="left"/>
+        <w:rPr>
+          <w:b w:val="false"/>
+          <w:bCs w:val="false"/>
+          <w:u w:val="none"/>
+        </w:rPr>
+      </w:pPr>
+      <w:r>
+        <w:rPr>
+          <w:b w:val="false"/>
+          <w:bCs w:val="false"/>
+          <w:u w:val="none"/>
+        </w:rPr>
+      </w:r>
+    </w:p>
+    <w:p>
+      <w:pPr>
+        <w:pStyle w:val="Normal"/>
+        <w:bidi w:val="0"/>
+        <w:jc w:val="left"/>
+        <w:rPr>
+          <w:b w:val="false"/>
+          <w:bCs w:val="false"/>
+          <w:u w:val="none"/>
+        </w:rPr>
+      </w:pPr>
+      <w:r>
+        <w:rPr>
+          <w:b w:val="false"/>
+          <w:bCs w:val="false"/>
+          <w:u w:val="none"/>
+        </w:rPr>
+        <w:t>-Link-State-Routing</w:t>
+      </w:r>
+    </w:p>
+    <w:p>
+      <w:pPr>
+        <w:pStyle w:val="Normal"/>
+        <w:bidi w:val="0"/>
+        <w:jc w:val="left"/>
+        <w:rPr>
+          <w:b w:val="false"/>
+          <w:bCs w:val="false"/>
+          <w:u w:val="none"/>
+        </w:rPr>
+      </w:pPr>
+      <w:r>
+        <w:rPr>
+          <w:b w:val="false"/>
+          <w:bCs w:val="false"/>
+          <w:u w:val="none"/>
+        </w:rPr>
+        <w:t>- Fluten</w:t>
+      </w:r>
+    </w:p>
+    <w:p>
+      <w:pPr>
+        <w:pStyle w:val="Normal"/>
+        <w:bidi w:val="0"/>
+        <w:jc w:val="left"/>
+        <w:rPr>
+          <w:b w:val="false"/>
+          <w:bCs w:val="false"/>
+          <w:u w:val="none"/>
+        </w:rPr>
+      </w:pPr>
+      <w:r>
+        <w:rPr>
+          <w:b w:val="false"/>
+          <w:bCs w:val="false"/>
+          <w:u w:val="none"/>
+        </w:rPr>
+        <w:t>- Shortest Path Dijkstra</w:t>
+      </w:r>
+    </w:p>
+    <w:p>
+      <w:pPr>
+        <w:pStyle w:val="Normal"/>
+        <w:bidi w:val="0"/>
+        <w:jc w:val="left"/>
+        <w:rPr>
+          <w:b w:val="false"/>
+          <w:bCs w:val="false"/>
+          <w:u w:val="none"/>
+        </w:rPr>
+      </w:pPr>
+      <w:r>
+        <w:rPr>
+          <w:b w:val="false"/>
+          <w:bCs w:val="false"/>
+          <w:u w:val="none"/>
+        </w:rPr>
+      </w:r>
+    </w:p>
+    <w:p>
+      <w:pPr>
+        <w:pStyle w:val="Normal"/>
+        <w:bidi w:val="0"/>
+        <w:jc w:val="left"/>
+        <w:rPr>
+          <w:b w:val="false"/>
+          <w:bCs w:val="false"/>
+          <w:u w:val="none"/>
+        </w:rPr>
+      </w:pPr>
+      <w:r>
+        <w:rPr>
+          <w:b w:val="false"/>
+          <w:bCs w:val="false"/>
+          <w:u w:val="none"/>
+        </w:rPr>
+        <w:t>Ablauf siehe nächste Seite →</w:t>
+      </w:r>
+    </w:p>
+    <w:p>
+      <w:pPr>
+        <w:pStyle w:val="Normal"/>
+        <w:bidi w:val="0"/>
+        <w:jc w:val="left"/>
+        <w:rPr>
+          <w:b w:val="false"/>
+          <w:bCs w:val="false"/>
+          <w:u w:val="none"/>
+        </w:rPr>
+      </w:pPr>
+      <w:r>
+        <w:rPr>
+          <w:b w:val="false"/>
+          <w:bCs w:val="false"/>
+          <w:u w:val="none"/>
+        </w:rPr>
+      </w:r>
+    </w:p>
+    <w:p>
+      <w:pPr>
+        <w:pStyle w:val="Normal"/>
+        <w:bidi w:val="0"/>
+        <w:jc w:val="left"/>
+        <w:rPr>
+          <w:b w:val="false"/>
+          <w:bCs w:val="false"/>
+          <w:u w:val="none"/>
+        </w:rPr>
+      </w:pPr>
+      <w:r>
+        <w:rPr>
+          <w:b w:val="false"/>
+          <w:bCs w:val="false"/>
+          <w:u w:val="none"/>
+        </w:rPr>
+      </w:r>
+    </w:p>
+    <w:p>
+      <w:pPr>
+        <w:pStyle w:val="Normal"/>
+        <w:bidi w:val="0"/>
+        <w:jc w:val="left"/>
+        <w:rPr>
+          <w:b w:val="false"/>
+          <w:bCs w:val="false"/>
+          <w:u w:val="none"/>
+        </w:rPr>
+      </w:pPr>
+      <w:r>
+        <w:rPr>
+          <w:b w:val="false"/>
+          <w:bCs w:val="false"/>
+          <w:u w:val="none"/>
+        </w:rPr>
+        <w:t>1. Fluten</w:t>
+      </w:r>
+    </w:p>
+    <w:p>
+      <w:pPr>
+        <w:pStyle w:val="Normal"/>
+        <w:bidi w:val="0"/>
+        <w:jc w:val="left"/>
+        <w:rPr>
+          <w:b w:val="false"/>
+          <w:bCs w:val="false"/>
+          <w:u w:val="none"/>
+        </w:rPr>
+      </w:pPr>
+      <w:r>
+        <w:rPr>
+          <w:b w:val="false"/>
+          <w:bCs w:val="false"/>
+          <w:u w:val="none"/>
+        </w:rPr>
+        <w:t>- V (Knoten) sendet Nachricht (Ping) an alle Nachbarn</w:t>
+      </w:r>
+    </w:p>
+    <w:p>
+      <w:pPr>
+        <w:pStyle w:val="Normal"/>
+        <w:bidi w:val="0"/>
+        <w:jc w:val="left"/>
+        <w:rPr>
+          <w:b w:val="false"/>
+          <w:bCs w:val="false"/>
+          <w:u w:val="none"/>
+        </w:rPr>
+      </w:pPr>
+      <w:r>
+        <w:rPr>
+          <w:b w:val="false"/>
+          <w:bCs w:val="false"/>
+          <w:u w:val="none"/>
+        </w:rPr>
+      </w:r>
+    </w:p>
+    <w:p>
+      <w:pPr>
+        <w:pStyle w:val="Normal"/>
+        <w:bidi w:val="0"/>
+        <w:jc w:val="left"/>
+        <w:rPr>
+          <w:b w:val="false"/>
+          <w:bCs w:val="false"/>
+          <w:u w:val="none"/>
+        </w:rPr>
+      </w:pPr>
+      <w:r>
+        <w:rPr>
+          <w:b w:val="false"/>
+          <w:bCs w:val="false"/>
+          <w:u w:val="none"/>
+        </w:rPr>
+        <w:t>2. LSR</w:t>
+      </w:r>
+    </w:p>
+    <w:p>
+      <w:pPr>
+        <w:pStyle w:val="Normal"/>
+        <w:bidi w:val="0"/>
+        <w:jc w:val="left"/>
+        <w:rPr>
+          <w:b w:val="false"/>
+          <w:bCs w:val="false"/>
+          <w:u w:val="none"/>
+        </w:rPr>
+      </w:pPr>
+      <w:r>
+        <w:rPr>
+          <w:b w:val="false"/>
+          <w:bCs w:val="false"/>
+          <w:u w:val="none"/>
+        </w:rPr>
+        <w:t>- LS Datenbanken pro V</w:t>
+      </w:r>
+    </w:p>
+    <w:p>
+      <w:pPr>
+        <w:pStyle w:val="Normal"/>
+        <w:bidi w:val="0"/>
+        <w:jc w:val="left"/>
+        <w:rPr>
+          <w:b w:val="false"/>
+          <w:bCs w:val="false"/>
+          <w:u w:val="none"/>
+        </w:rPr>
+      </w:pPr>
+      <w:r>
+        <w:rPr>
+          <w:b w:val="false"/>
+          <w:bCs w:val="false"/>
+          <w:u w:val="none"/>
+        </w:rPr>
+        <w:t>- LS Pakete je V</w:t>
+      </w:r>
+    </w:p>
+    <w:p>
+      <w:pPr>
+        <w:pStyle w:val="Normal"/>
+        <w:bidi w:val="0"/>
+        <w:jc w:val="left"/>
+        <w:rPr>
+          <w:b w:val="false"/>
+          <w:bCs w:val="false"/>
+          <w:u w:val="none"/>
+        </w:rPr>
+      </w:pPr>
+      <w:r>
+        <w:rPr>
+          <w:b w:val="false"/>
+          <w:bCs w:val="false"/>
+          <w:u w:val="none"/>
+        </w:rPr>
+      </w:r>
+    </w:p>
+    <w:p>
+      <w:pPr>
+        <w:pStyle w:val="Normal"/>
+        <w:bidi w:val="0"/>
+        <w:jc w:val="left"/>
+        <w:rPr>
+          <w:b w:val="false"/>
+          <w:bCs w:val="false"/>
+          <w:u w:val="none"/>
+        </w:rPr>
+      </w:pPr>
+      <w:r>
+        <w:rPr>
+          <w:b w:val="false"/>
+          <w:bCs w:val="false"/>
+          <w:u w:val="none"/>
+        </w:rPr>
+        <w:t>3. Dijkst</w:t>
+      </w:r>
+      <w:r>
+        <w:rPr>
+          <w:b w:val="false"/>
+          <w:bCs w:val="false"/>
+          <w:u w:val="none"/>
+        </w:rPr>
+        <w:t>r</w:t>
+      </w:r>
+      <w:r>
+        <w:rPr>
+          <w:b w:val="false"/>
+          <w:bCs w:val="false"/>
+          <w:u w:val="none"/>
+        </w:rPr>
+        <w:t>a</w:t>
+      </w:r>
+    </w:p>
+    <w:p>
+      <w:pPr>
+        <w:pStyle w:val="Normal"/>
+        <w:bidi w:val="0"/>
+        <w:jc w:val="left"/>
+        <w:rPr>
+          <w:b w:val="false"/>
+          <w:bCs w:val="false"/>
+          <w:u w:val="none"/>
+        </w:rPr>
+      </w:pPr>
+      <w:r>
+        <w:rPr>
+          <w:b w:val="false"/>
+          <w:bCs w:val="false"/>
+          <w:u w:val="none"/>
+        </w:rPr>
+      </w:r>
+    </w:p>
+    <w:p>
+      <w:pPr>
+        <w:pStyle w:val="Normal"/>
+        <w:bidi w:val="0"/>
+        <w:jc w:val="left"/>
+        <w:rPr>
+          <w:b w:val="false"/>
+          <w:bCs w:val="false"/>
+          <w:u w:val="none"/>
+        </w:rPr>
+      </w:pPr>
+      <w:r>
+        <w:rPr>
+          <w:b w:val="false"/>
+          <w:bCs w:val="false"/>
+          <w:u w:val="none"/>
+        </w:rPr>
+        <w:t>d = Abstand</w:t>
+      </w:r>
+    </w:p>
+    <w:p>
+      <w:pPr>
+        <w:pStyle w:val="Normal"/>
+        <w:bidi w:val="0"/>
+        <w:jc w:val="left"/>
+        <w:rPr>
+          <w:b w:val="false"/>
+          <w:bCs w:val="false"/>
+          <w:u w:val="none"/>
+        </w:rPr>
+      </w:pPr>
+      <w:r>
+        <w:rPr>
+          <w:b w:val="false"/>
+          <w:bCs w:val="false"/>
+          <w:u w:val="none"/>
+        </w:rPr>
+        <w:t>c = Gewicht</w:t>
+      </w:r>
+    </w:p>
+    <w:p>
+      <w:pPr>
+        <w:pStyle w:val="Normal"/>
+        <w:bidi w:val="0"/>
+        <w:jc w:val="left"/>
+        <w:rPr>
+          <w:b w:val="false"/>
+          <w:bCs w:val="false"/>
+          <w:u w:val="none"/>
+        </w:rPr>
+      </w:pPr>
+      <w:r>
+        <w:rPr>
+          <w:b w:val="false"/>
+          <w:bCs w:val="false"/>
+          <w:u w:val="none"/>
+        </w:rPr>
+        <w:t>p = Vorgänger</w:t>
+      </w:r>
+    </w:p>
+    <w:p>
+      <w:pPr>
+        <w:pStyle w:val="Normal"/>
+        <w:bidi w:val="0"/>
+        <w:jc w:val="left"/>
+        <w:rPr>
+          <w:b w:val="false"/>
+          <w:bCs w:val="false"/>
+          <w:u w:val="none"/>
+        </w:rPr>
+      </w:pPr>
+      <w:r>
+        <w:rPr>
+          <w:b w:val="false"/>
+          <w:bCs w:val="false"/>
+          <w:u w:val="none"/>
+        </w:rPr>
+        <w:t>s = start</w:t>
+      </w:r>
+    </w:p>
+    <w:p>
+      <w:pPr>
+        <w:pStyle w:val="Normal"/>
+        <w:bidi w:val="0"/>
+        <w:jc w:val="left"/>
+        <w:rPr>
+          <w:b w:val="false"/>
+          <w:bCs w:val="false"/>
+          <w:u w:val="none"/>
+        </w:rPr>
+      </w:pPr>
+      <w:r>
+        <w:rPr>
+          <w:b w:val="false"/>
+          <w:bCs w:val="false"/>
+          <w:u w:val="none"/>
+        </w:rPr>
+        <w:t>z = ziel</w:t>
+      </w:r>
+    </w:p>
+    <w:p>
+      <w:pPr>
+        <w:pStyle w:val="Normal"/>
+        <w:bidi w:val="0"/>
+        <w:jc w:val="left"/>
+        <w:rPr>
+          <w:b w:val="false"/>
+          <w:bCs w:val="false"/>
+          <w:u w:val="none"/>
+        </w:rPr>
+      </w:pPr>
+      <w:r>
+        <w:rPr>
+          <w:b w:val="false"/>
+          <w:bCs w:val="false"/>
+          <w:u w:val="none"/>
+        </w:rPr>
+      </w:r>
+    </w:p>
+    <w:p>
+      <w:pPr>
+        <w:pStyle w:val="Normal"/>
+        <w:bidi w:val="0"/>
+        <w:jc w:val="left"/>
+        <w:rPr>
+          <w:b w:val="false"/>
+          <w:bCs w:val="false"/>
+          <w:u w:val="none"/>
+        </w:rPr>
+      </w:pPr>
+      <w:r>
+        <w:rPr>
+          <w:b w:val="false"/>
+          <w:bCs w:val="false"/>
+          <w:u w:val="none"/>
+        </w:rPr>
+        <w:t>for each vertex v</w:t>
+      </w:r>
+    </w:p>
+    <w:p>
+      <w:pPr>
+        <w:pStyle w:val="Normal"/>
+        <w:bidi w:val="0"/>
+        <w:jc w:val="left"/>
+        <w:rPr>
+          <w:b w:val="false"/>
+          <w:bCs w:val="false"/>
+          <w:u w:val="none"/>
+        </w:rPr>
+      </w:pPr>
+      <w:r>
+        <w:rPr>
+          <w:b w:val="false"/>
+          <w:bCs w:val="false"/>
+          <w:u w:val="none"/>
+        </w:rPr>
+        <w:tab/>
+        <w:t>d[v] = ∞</w:t>
+      </w:r>
+    </w:p>
+    <w:p>
+      <w:pPr>
+        <w:pStyle w:val="Normal"/>
+        <w:bidi w:val="0"/>
+        <w:jc w:val="left"/>
+        <w:rPr>
+          <w:b w:val="false"/>
+          <w:bCs w:val="false"/>
+          <w:u w:val="none"/>
+        </w:rPr>
+      </w:pPr>
+      <w:r>
+        <w:rPr>
+          <w:b w:val="false"/>
+          <w:bCs w:val="false"/>
+          <w:u w:val="none"/>
+        </w:rPr>
+        <w:tab/>
+        <w:t>p[v] = none</w:t>
+      </w:r>
+    </w:p>
+    <w:p>
+      <w:pPr>
+        <w:pStyle w:val="Normal"/>
+        <w:bidi w:val="0"/>
+        <w:jc w:val="left"/>
+        <w:rPr>
+          <w:b w:val="false"/>
+          <w:bCs w:val="false"/>
+          <w:u w:val="none"/>
+        </w:rPr>
+      </w:pPr>
+      <w:r>
+        <w:rPr>
+          <w:b w:val="false"/>
+          <w:bCs w:val="false"/>
+          <w:u w:val="none"/>
+        </w:rPr>
+        <w:t>d[s] = 0</w:t>
+      </w:r>
+    </w:p>
+    <w:p>
+      <w:pPr>
+        <w:pStyle w:val="Normal"/>
+        <w:bidi w:val="0"/>
+        <w:jc w:val="left"/>
+        <w:rPr>
+          <w:b w:val="false"/>
+          <w:bCs w:val="false"/>
+          <w:u w:val="none"/>
+        </w:rPr>
+      </w:pPr>
+      <w:r>
+        <w:rPr>
+          <w:b w:val="false"/>
+          <w:bCs w:val="false"/>
+          <w:u w:val="none"/>
+        </w:rPr>
+      </w:r>
+    </w:p>
+    <w:p>
+      <w:pPr>
+        <w:pStyle w:val="Normal"/>
+        <w:bidi w:val="0"/>
+        <w:jc w:val="left"/>
+        <w:rPr>
+          <w:b w:val="false"/>
+          <w:bCs w:val="false"/>
+          <w:u w:val="none"/>
+        </w:rPr>
+      </w:pPr>
+      <w:r>
+        <w:rPr>
+          <w:b w:val="false"/>
+          <w:bCs w:val="false"/>
+          <w:u w:val="none"/>
+        </w:rPr>
+        <w:t>set all vertices to unexplored vertex, set v to explored</w:t>
+      </w:r>
+    </w:p>
+    <w:p>
+      <w:pPr>
+        <w:pStyle w:val="Normal"/>
+        <w:bidi w:val="0"/>
+        <w:jc w:val="left"/>
+        <w:rPr>
+          <w:b w:val="false"/>
+          <w:bCs w:val="false"/>
+          <w:u w:val="none"/>
+        </w:rPr>
+      </w:pPr>
+      <w:r>
+        <w:rPr>
+          <w:b w:val="false"/>
+          <w:bCs w:val="false"/>
+          <w:u w:val="none"/>
+        </w:rPr>
+      </w:r>
+    </w:p>
+    <w:p>
+      <w:pPr>
+        <w:pStyle w:val="Normal"/>
+        <w:bidi w:val="0"/>
+        <w:jc w:val="left"/>
+        <w:rPr>
+          <w:b w:val="false"/>
+          <w:bCs w:val="false"/>
+          <w:u w:val="none"/>
+        </w:rPr>
+      </w:pPr>
+      <w:r>
+        <w:rPr>
+          <w:b w:val="false"/>
+          <w:bCs w:val="false"/>
+          <w:u w:val="none"/>
+        </w:rPr>
+        <w:t>for each edge(v,w):</w:t>
+      </w:r>
+    </w:p>
+    <w:p>
+      <w:pPr>
+        <w:pStyle w:val="Normal"/>
+        <w:bidi w:val="0"/>
+        <w:jc w:val="left"/>
+        <w:rPr>
+          <w:b w:val="false"/>
+          <w:bCs w:val="false"/>
+          <w:u w:val="none"/>
+        </w:rPr>
+      </w:pPr>
+      <w:r>
+        <w:rPr>
+          <w:b w:val="false"/>
+          <w:bCs w:val="false"/>
+          <w:u w:val="none"/>
+        </w:rPr>
+        <w:tab/>
+        <w:t>if d[v]+c(v,w)&lt;d[w]</w:t>
+      </w:r>
+    </w:p>
+    <w:p>
+      <w:pPr>
+        <w:pStyle w:val="Normal"/>
+        <w:bidi w:val="0"/>
+        <w:jc w:val="left"/>
+        <w:rPr>
+          <w:b w:val="false"/>
+          <w:bCs w:val="false"/>
+          <w:u w:val="none"/>
+        </w:rPr>
+      </w:pPr>
+      <w:r>
+        <w:rPr>
+          <w:b w:val="false"/>
+          <w:bCs w:val="false"/>
+          <w:u w:val="none"/>
+        </w:rPr>
+        <w:tab/>
+        <w:tab/>
+        <w:t>d[w]=d[v]+c(v,w)</w:t>
+      </w:r>
+    </w:p>
+    <w:p>
+      <w:pPr>
+        <w:pStyle w:val="Normal"/>
+        <w:bidi w:val="0"/>
+        <w:jc w:val="left"/>
+        <w:rPr>
+          <w:b w:val="false"/>
+          <w:bCs w:val="false"/>
+          <w:u w:val="none"/>
+        </w:rPr>
+      </w:pPr>
+      <w:r>
+        <w:rPr>
+          <w:b w:val="false"/>
+          <w:bCs w:val="false"/>
+          <w:u w:val="none"/>
+        </w:rPr>
+        <w:tab/>
+        <w:t>p[w]=v</w:t>
       </w:r>
     </w:p>
     <w:sectPr>

</xml_diff>